<commit_message>
docs: align requirements with current implementation
</commit_message>
<xml_diff>
--- a/docs/01_프로젝트기술서_요구사항정의서_화면설계서.docx
+++ b/docs/01_프로젝트기술서_요구사항정의서_화면설계서.docx
@@ -614,7 +614,7 @@
                 <w:b w:val="0"/>
                 <w:sz w:val="17"/>
               </w:rPr>
-              <w:t>약 이름·모양·색깔·각인으로 의약품을 검색하고 국내·해외 안전정보, 즐겨찾기 및 조합 안전점검을 제공하는 웹 서비스</w:t>
+              <w:t>약 이름·모양·색깔로 의약품을 검색하고 국내·해외 안전정보, 즐겨찾기 및 조합 안전점검을 제공하는 웹 서비스</w:t>
             </w:r>
           </w:p>
         </w:tc>
@@ -656,7 +656,7 @@
                 <w:b w:val="0"/>
                 <w:sz w:val="17"/>
               </w:rPr>
-              <w:t>프론트엔드 Vue 3 / 백엔드 Java Spring Boot / DB MySQL 8 / 외부 API 낱알식별정보·e약은요·DUR·openFDA</w:t>
+              <w:t>프론트엔드 Vue 3 / 백엔드 Java Spring Boot / DB PostgreSQL(Supabase) / 외부 API 낱알식별정보·e약은요·DUR·openFDA</w:t>
             </w:r>
           </w:p>
         </w:tc>
@@ -1090,7 +1090,7 @@
                 <w:b w:val="0"/>
                 <w:sz w:val="13"/>
               </w:rPr>
-              <w:t>비밀번호 영문+숫자</w:t>
+              <w:t>비밀번호 영문+숫자+기호</w:t>
             </w:r>
           </w:p>
         </w:tc>
@@ -1496,7 +1496,7 @@
                 <w:b w:val="0"/>
                 <w:sz w:val="13"/>
               </w:rPr>
-              <w:t>모양·색깔·각인 검색</w:t>
+              <w:t>모양·색깔 검색</w:t>
             </w:r>
           </w:p>
         </w:tc>
@@ -1516,7 +1516,7 @@
                 <w:b w:val="0"/>
                 <w:sz w:val="13"/>
               </w:rPr>
-              <w:t>모양·색깔·각인 문자 조합으로 의약품을 검색한다.</w:t>
+              <w:t>모양·색깔 조건으로 의약품을 검색한다.</w:t>
             </w:r>
           </w:p>
         </w:tc>
@@ -2326,7 +2326,7 @@
                 <w:b w:val="0"/>
                 <w:sz w:val="13"/>
               </w:rPr>
-              <w:t>즐겨찾기에 등록된 약물 쌍 전체에 대해 병용금기, 주의 및 성분중복 여부를 점검한다.</w:t>
+              <w:t>즐겨찾기에 등록된 약물 쌍 전체에 대해 DUR 병용금기 및 주의 여부를 점검한다. 동일 성분·효능군 중복은 상세 화면에서 확인한다.</w:t>
             </w:r>
           </w:p>
         </w:tc>
@@ -2812,7 +2812,7 @@
                 <w:b w:val="0"/>
                 <w:sz w:val="13"/>
               </w:rPr>
-              <w:t>최근 검색어 5건, 즐겨찾기 수, 안전점검 요약을 표시한다.</w:t>
+              <w:t>최근 검색어 5건, 즐겨찾기 수, DUR 경고 여부를 표시한다.</w:t>
             </w:r>
           </w:p>
         </w:tc>
@@ -3358,7 +3358,7 @@
                 <w:b w:val="0"/>
                 <w:sz w:val="13"/>
               </w:rPr>
-              <w:t>ATC 미확보 시 available=false, 복합제는 주성분 기준</w:t>
+              <w:t>성분 매핑 실패 시 available=false, 복합제는 주성분 기준</w:t>
             </w:r>
           </w:p>
         </w:tc>
@@ -3681,7 +3681,7 @@
                 <w:b w:val="0"/>
                 <w:sz w:val="14"/>
               </w:rPr>
-              <w:t>타임아웃 3초, 재시도 1회</w:t>
+              <w:t>타임아웃 3초, API별 제한된 재시도</w:t>
             </w:r>
           </w:p>
         </w:tc>
@@ -4047,7 +4047,7 @@
                 <w:b w:val="0"/>
                 <w:sz w:val="14"/>
               </w:rPr>
-              <w:t>국내 제품과 해외 영문 성분명 매핑은 ATC 코드, 한글 성분명 사전 순으로 폴백하고 모두 실패 시 정보 없음 처리 후 로그를 기록한다.</w:t>
+              <w:t>국내 제품과 해외 영문 성분명 매핑은 기존 ingredient_en, ATC 코드, 한글 성분명 사전 순으로 폴백하고 모두 실패 시 정보 없음 처리 후 로그를 기록한다.</w:t>
             </w:r>
           </w:p>
         </w:tc>
@@ -4107,7 +4107,7 @@
                 <w:b w:val="0"/>
                 <w:sz w:val="14"/>
               </w:rPr>
-              <w:t>실패 결과도 캐싱</w:t>
+              <w:t>매핑 실패 시 정보 없음 처리</w:t>
             </w:r>
           </w:p>
         </w:tc>
@@ -4391,7 +4391,7 @@
                 <w:b w:val="0"/>
                 <w:sz w:val="14"/>
               </w:rPr>
-              <w:t>외부 호출 응답시간 포함</w:t>
+              <w:t>외부 연동 오류 유형 기록</w:t>
             </w:r>
           </w:p>
         </w:tc>
@@ -6990,7 +6990,7 @@
               <w:br/>
               <w:t>│ 이메일     [____________________]         │</w:t>
               <w:br/>
-              <w:t>│ 비밀번호   [영문+숫자, 최소 길이]          │</w:t>
+              <w:t>│ 비밀번호   [영문+숫자+기호, 최소 길이]          │</w:t>
               <w:br/>
               <w:t>│ 확인       [____________________]         │</w:t>
               <w:br/>
@@ -7533,7 +7533,7 @@
                 <w:b w:val="0"/>
                 <w:sz w:val="14"/>
               </w:rPr>
-              <w:t>영문·숫자 조합 정책 검증</w:t>
+              <w:t>영문·숫자·기호 조합 정책 검증</w:t>
             </w:r>
           </w:p>
         </w:tc>
@@ -9056,15 +9056,15 @@
               <w:br/>
               <w:t>│ 의약품 검색                                       │</w:t>
               <w:br/>
-              <w:t>│ [ 이름 검색 ] [ 모양·색깔·각인 검색 ]             │</w:t>
+              <w:t>│ [ 이름 검색 ] [ 모양·색깔 검색 ]                  │</w:t>
               <w:br/>
-              <w:t>│ 이름/모양/색깔/각인 [________________] [검색]     │</w:t>
+              <w:t>│ 이름/모양/색깔 [________________] [검색]          │</w:t>
               <w:br/>
               <w:t>├──────────────────────────────────────────────────┤</w:t>
               <w:br/>
-              <w:t>│ [낱알 이미지] 제품명 · 제조사 · 모양/색/각인  &gt;   │</w:t>
+              <w:t>│ [낱알 이미지] 제품명 · 제조사 · 모양/색       &gt;   │</w:t>
               <w:br/>
-              <w:t>│ [낱알 이미지] 제품명 · 제조사 · 모양/색/각인  &gt;   │</w:t>
+              <w:t>│ [낱알 이미지] 제품명 · 제조사 · 모양/색       &gt;   │</w:t>
               <w:br/>
               <w:t>└──────────────────────────────────────────────────┘</w:t>
             </w:r>
@@ -9661,7 +9661,7 @@
                 <w:b w:val="0"/>
                 <w:sz w:val="14"/>
               </w:rPr>
-              <w:t>각인 문자 입력</w:t>
+              <w:t>검색 버튼</w:t>
             </w:r>
           </w:p>
         </w:tc>
@@ -9681,7 +9681,7 @@
                 <w:b w:val="0"/>
                 <w:sz w:val="14"/>
               </w:rPr>
-              <w:t>빈 값</w:t>
+              <w:t>검색 조건 충족 시 활성</w:t>
             </w:r>
           </w:p>
         </w:tc>
@@ -9701,7 +9701,7 @@
                 <w:b w:val="0"/>
                 <w:sz w:val="14"/>
               </w:rPr>
-              <w:t>텍스트 입력</w:t>
+              <w:t>클릭·Enter</w:t>
             </w:r>
           </w:p>
         </w:tc>
@@ -9721,7 +9721,7 @@
                 <w:b w:val="0"/>
                 <w:sz w:val="14"/>
               </w:rPr>
-              <w:t>앞/뒤 각인 문자 검색 조건으로 전달</w:t>
+              <w:t>검색 API 호출</w:t>
             </w:r>
           </w:p>
         </w:tc>
@@ -9741,7 +9741,7 @@
                 <w:b w:val="0"/>
                 <w:sz w:val="14"/>
               </w:rPr>
-              <w:t>대소문자·공백 정규화</w:t>
+              <w:t>로딩 중 중복 요청 방지</w:t>
             </w:r>
           </w:p>
         </w:tc>
@@ -9764,128 +9764,6 @@
                 <w:sz w:val="14"/>
               </w:rPr>
               <w:t>5</w:t>
-            </w:r>
-          </w:p>
-        </w:tc>
-        <w:tc>
-          <w:tcPr>
-            <w:tcW w:type="dxa" w:w="1531"/>
-            <w:vAlign w:val="center"/>
-          </w:tcPr>
-          <w:p>
-            <w:pPr>
-              <w:jc w:val="left"/>
-            </w:pPr>
-            <w:r/>
-            <w:r>
-              <w:rPr>
-                <w:rFonts w:ascii="Malgun Gothic" w:hAnsi="Malgun Gothic" w:eastAsia="Malgun Gothic"/>
-                <w:b w:val="0"/>
-                <w:sz w:val="14"/>
-              </w:rPr>
-              <w:t>검색 버튼</w:t>
-            </w:r>
-          </w:p>
-        </w:tc>
-        <w:tc>
-          <w:tcPr>
-            <w:tcW w:type="dxa" w:w="1814"/>
-            <w:vAlign w:val="center"/>
-          </w:tcPr>
-          <w:p>
-            <w:pPr>
-              <w:jc w:val="left"/>
-            </w:pPr>
-            <w:r/>
-            <w:r>
-              <w:rPr>
-                <w:rFonts w:ascii="Malgun Gothic" w:hAnsi="Malgun Gothic" w:eastAsia="Malgun Gothic"/>
-                <w:b w:val="0"/>
-                <w:sz w:val="14"/>
-              </w:rPr>
-              <w:t>검색 조건 충족 시 활성</w:t>
-            </w:r>
-          </w:p>
-        </w:tc>
-        <w:tc>
-          <w:tcPr>
-            <w:tcW w:type="dxa" w:w="1304"/>
-            <w:vAlign w:val="center"/>
-          </w:tcPr>
-          <w:p>
-            <w:pPr>
-              <w:jc w:val="left"/>
-            </w:pPr>
-            <w:r/>
-            <w:r>
-              <w:rPr>
-                <w:rFonts w:ascii="Malgun Gothic" w:hAnsi="Malgun Gothic" w:eastAsia="Malgun Gothic"/>
-                <w:b w:val="0"/>
-                <w:sz w:val="14"/>
-              </w:rPr>
-              <w:t>클릭·Enter</w:t>
-            </w:r>
-          </w:p>
-        </w:tc>
-        <w:tc>
-          <w:tcPr>
-            <w:tcW w:type="dxa" w:w="2268"/>
-            <w:vAlign w:val="center"/>
-          </w:tcPr>
-          <w:p>
-            <w:pPr>
-              <w:jc w:val="left"/>
-            </w:pPr>
-            <w:r/>
-            <w:r>
-              <w:rPr>
-                <w:rFonts w:ascii="Malgun Gothic" w:hAnsi="Malgun Gothic" w:eastAsia="Malgun Gothic"/>
-                <w:b w:val="0"/>
-                <w:sz w:val="14"/>
-              </w:rPr>
-              <w:t>검색 API 호출</w:t>
-            </w:r>
-          </w:p>
-        </w:tc>
-        <w:tc>
-          <w:tcPr>
-            <w:tcW w:type="dxa" w:w="1020"/>
-            <w:vAlign w:val="center"/>
-          </w:tcPr>
-          <w:p>
-            <w:pPr>
-              <w:jc w:val="left"/>
-            </w:pPr>
-            <w:r/>
-            <w:r>
-              <w:rPr>
-                <w:rFonts w:ascii="Malgun Gothic" w:hAnsi="Malgun Gothic" w:eastAsia="Malgun Gothic"/>
-                <w:b w:val="0"/>
-                <w:sz w:val="14"/>
-              </w:rPr>
-              <w:t>로딩 중 중복 요청 방지</w:t>
-            </w:r>
-          </w:p>
-        </w:tc>
-      </w:tr>
-      <w:tr>
-        <w:tc>
-          <w:tcPr>
-            <w:tcW w:type="dxa" w:w="397"/>
-            <w:vAlign w:val="center"/>
-          </w:tcPr>
-          <w:p>
-            <w:pPr>
-              <w:jc w:val="left"/>
-            </w:pPr>
-            <w:r/>
-            <w:r>
-              <w:rPr>
-                <w:rFonts w:ascii="Malgun Gothic" w:hAnsi="Malgun Gothic" w:eastAsia="Malgun Gothic"/>
-                <w:b w:val="0"/>
-                <w:sz w:val="14"/>
-              </w:rPr>
-              <w:t>6</w:t>
             </w:r>
           </w:p>
         </w:tc>
@@ -10100,7 +9978,7 @@
                 <w:b w:val="0"/>
                 <w:sz w:val="16"/>
               </w:rPr>
-              <w:t>GET /api/drugs/search?name=&amp;shape=&amp;color=&amp;mark=</w:t>
+              <w:t>GET /api/drugs/search?name=&amp;shape=&amp;color=</w:t>
             </w:r>
           </w:p>
         </w:tc>
@@ -13384,7 +13262,7 @@
                 <w:b w:val="0"/>
                 <w:sz w:val="16"/>
               </w:rPr>
-              <w:t>즐겨찾기 약과 조합 안전점검 결과를 관리한다.</w:t>
+              <w:t>즐겨찾기 약과 DUR 병용금기·주의 점검 결과를 관리한다.</w:t>
             </w:r>
           </w:p>
         </w:tc>
@@ -13442,7 +13320,7 @@
               <w:br/>
               <w:t>│ 즐겨찾기한 약                                  │</w:t>
               <w:br/>
-              <w:t>│ [안전점검 배너: 금기·주의·성분중복]            │</w:t>
+              <w:t>│ [DUR 경고 배너: 금기·주의]            │</w:t>
               <w:br/>
               <w:t>│ [이미지] 제품명·제조사·주성분          [해제]  │</w:t>
               <w:br/>
@@ -13681,7 +13559,7 @@
                 <w:b w:val="0"/>
                 <w:sz w:val="14"/>
               </w:rPr>
-              <w:t>조합 안전점검 배너</w:t>
+              <w:t>DUR 경고 배너</w:t>
             </w:r>
           </w:p>
         </w:tc>
@@ -13741,7 +13619,7 @@
                 <w:b w:val="0"/>
                 <w:sz w:val="14"/>
               </w:rPr>
-              <w:t>병용금기·주의·성분중복 상세 확인</w:t>
+              <w:t>병용금기·주의 상세 확인</w:t>
             </w:r>
           </w:p>
         </w:tc>
@@ -15263,13 +15141,13 @@
               <w:br/>
               <w:t>│ 안녕하세요, 사용자님                            │</w:t>
               <w:br/>
-              <w:t>│ [즐겨찾기 수] [안전점검 경고 수] [약 검색]     │</w:t>
+              <w:t>│ [즐겨찾기 수] [DUR 경고 여부] [약 검색]     │</w:t>
               <w:br/>
               <w:t>│ 최근 검색                                      │</w:t>
               <w:br/>
               <w:t>│ · 타이레놀 / 이름 검색                          │</w:t>
               <w:br/>
-              <w:t>│ · 흰색 · 타원형 · 각인 / 외형 검색             │</w:t>
+              <w:t>│ · 흰색 · 타원형 / 외형 검색             │</w:t>
               <w:br/>
               <w:t>└──────────────────────────────────────────────┘</w:t>
             </w:r>
@@ -15522,7 +15400,7 @@
                 <w:b w:val="0"/>
                 <w:sz w:val="14"/>
               </w:rPr>
-              <w:t>즐겨찾기·안전점검 요약</w:t>
+              <w:t>즐겨찾기·DUR 경고 여부</w:t>
             </w:r>
           </w:p>
         </w:tc>
@@ -15703,7 +15581,7 @@
                 <w:b w:val="0"/>
                 <w:sz w:val="14"/>
               </w:rPr>
-              <w:t>이름·모양·색·각인 복원</w:t>
+              <w:t>이름·모양·색 조건 복원</w:t>
             </w:r>
           </w:p>
         </w:tc>

</xml_diff>